<commit_message>
Korekcije projekta prema zahtevima profesora
</commit_message>
<xml_diff>
--- a/Dokumentacija/Seminarski_rad_Godisnji_odmori.docx
+++ b/Dokumentacija/Seminarski_rad_Godisnji_odmori.docx
@@ -40,6 +40,10 @@
               <w:jc w:val="center"/>
             </w:pPr>
             <w:r>
+              <w:rPr>
+                <w:b/>
+                <w:color w:val="FFFFFF"/>
+              </w:rPr>
               <w:drawing>
                 <wp:inline distT="0" distB="0" distL="114300" distR="114300">
                   <wp:extent cx="935990" cy="930910"/>
@@ -98,7 +102,8 @@
             <w:r>
               <w:rPr>
                 <w:rFonts w:ascii="Times New Roman" w:hAnsi="Times New Roman"/>
-                <w:color w:val="000000"/>
+                <w:b/>
+                <w:color w:val="FFFFFF"/>
                 <w:sz w:val="28"/>
               </w:rPr>
               <w:t>Univerzitet u Novom Sadu</w:t>
@@ -106,7 +111,8 @@
             <w:r>
               <w:rPr>
                 <w:rFonts w:ascii="Times New Roman" w:hAnsi="Times New Roman"/>
-                <w:color w:val="000000"/>
+                <w:b/>
+                <w:color w:val="FFFFFF"/>
                 <w:sz w:val="28"/>
               </w:rPr>
               <w:br w:type="textWrapping"/>
@@ -114,7 +120,8 @@
             <w:r>
               <w:rPr>
                 <w:rFonts w:ascii="Times New Roman" w:hAnsi="Times New Roman"/>
-                <w:color w:val="000000"/>
+                <w:b/>
+                <w:color w:val="FFFFFF"/>
                 <w:sz w:val="28"/>
               </w:rPr>
               <w:t>Tehnički fakultet „Mihajlo Pupin“</w:t>
@@ -122,7 +129,8 @@
             <w:r>
               <w:rPr>
                 <w:rFonts w:ascii="Times New Roman" w:hAnsi="Times New Roman"/>
-                <w:color w:val="000000"/>
+                <w:b/>
+                <w:color w:val="FFFFFF"/>
                 <w:sz w:val="28"/>
               </w:rPr>
               <w:br w:type="textWrapping"/>
@@ -130,7 +138,8 @@
             <w:r>
               <w:rPr>
                 <w:rFonts w:ascii="Times New Roman" w:hAnsi="Times New Roman"/>
-                <w:color w:val="000000"/>
+                <w:b/>
+                <w:color w:val="FFFFFF"/>
                 <w:sz w:val="28"/>
               </w:rPr>
               <w:t>Zrenjanin</w:t>
@@ -153,6 +162,10 @@
               <w:jc w:val="center"/>
             </w:pPr>
             <w:r>
+              <w:rPr>
+                <w:b/>
+                <w:color w:val="FFFFFF"/>
+              </w:rPr>
               <w:drawing>
                 <wp:inline distT="0" distB="0" distL="114300" distR="114300">
                   <wp:extent cx="971550" cy="971550"/>
@@ -317,7 +330,8 @@
             <w:r>
               <w:rPr>
                 <w:rFonts w:ascii="Times New Roman" w:hAnsi="Times New Roman"/>
-                <w:color w:val="000000"/>
+                <w:b/>
+                <w:color w:val="FFFFFF"/>
                 <w:sz w:val="24"/>
               </w:rPr>
               <w:t>Predmetni nastavnik: Prof. dr Ljubica Kazi</w:t>
@@ -342,7 +356,8 @@
             <w:r>
               <w:rPr>
                 <w:rFonts w:ascii="Times New Roman" w:hAnsi="Times New Roman"/>
-                <w:color w:val="000000"/>
+                <w:b/>
+                <w:color w:val="FFFFFF"/>
                 <w:sz w:val="24"/>
               </w:rPr>
               <w:t>Student: Srđan Nedić</w:t>
@@ -493,31 +508,9 @@
         <w:ind w:left="0" w:firstLine="0"/>
       </w:pPr>
       <w:r>
-        <w:rPr>
-          <w:rFonts w:ascii="Times New Roman" w:hAnsi="Times New Roman"/>
-          <w:b/>
-          <w:color w:val="000000"/>
-          <w:sz w:val="19"/>
-        </w:rPr>
         <w:t>1. UVOD</w:t>
-      </w:r>
-      <w:r>
-        <w:rPr>
-          <w:rFonts w:ascii="Times New Roman" w:hAnsi="Times New Roman"/>
-          <w:b/>
-          <w:color w:val="000000"/>
-          <w:sz w:val="19"/>
-        </w:rPr>
         <w:tab/>
-      </w:r>
-      <w:r>
-        <w:rPr>
-          <w:rFonts w:ascii="Times New Roman" w:hAnsi="Times New Roman"/>
-          <w:b/>
-          <w:color w:val="000000"/>
-          <w:sz w:val="19"/>
-        </w:rPr>
-        <w:t>3</w:t>
+        <w:t>4</w:t>
       </w:r>
     </w:p>
     <w:p>
@@ -529,138 +522,8 @@
         <w:ind w:left="0" w:firstLine="0"/>
       </w:pPr>
       <w:r>
-        <w:rPr>
-          <w:rFonts w:ascii="Times New Roman" w:hAnsi="Times New Roman"/>
-          <w:b/>
-          <w:color w:val="000000"/>
-          <w:sz w:val="19"/>
-        </w:rPr>
         <w:t>2. ANALIZA POSLOVNOG PROCESA</w:t>
-      </w:r>
-      <w:r>
-        <w:rPr>
-          <w:rFonts w:ascii="Times New Roman" w:hAnsi="Times New Roman"/>
-          <w:b/>
-          <w:color w:val="000000"/>
-          <w:sz w:val="19"/>
-        </w:rPr>
         <w:tab/>
-      </w:r>
-      <w:r>
-        <w:rPr>
-          <w:rFonts w:ascii="Times New Roman" w:hAnsi="Times New Roman"/>
-          <w:b/>
-          <w:color w:val="000000"/>
-          <w:sz w:val="19"/>
-        </w:rPr>
-        <w:t>3</w:t>
-      </w:r>
-    </w:p>
-    <w:p>
-      <w:pPr>
-        <w:tabs>
-          <w:tab w:val="right" w:leader="dot" w:pos="7994"/>
-        </w:tabs>
-        <w:spacing w:after="20" w:line="240" w:lineRule="auto"/>
-        <w:ind w:left="397" w:firstLine="0"/>
-      </w:pPr>
-      <w:r>
-        <w:rPr>
-          <w:rFonts w:ascii="Times New Roman" w:hAnsi="Times New Roman"/>
-          <w:b w:val="0"/>
-          <w:color w:val="000000"/>
-          <w:sz w:val="19"/>
-        </w:rPr>
-        <w:t>2.1. Opis procesa</w:t>
-      </w:r>
-      <w:r>
-        <w:rPr>
-          <w:rFonts w:ascii="Times New Roman" w:hAnsi="Times New Roman"/>
-          <w:b w:val="0"/>
-          <w:color w:val="000000"/>
-          <w:sz w:val="19"/>
-        </w:rPr>
-        <w:tab/>
-      </w:r>
-      <w:r>
-        <w:rPr>
-          <w:rFonts w:ascii="Times New Roman" w:hAnsi="Times New Roman"/>
-          <w:b w:val="0"/>
-          <w:color w:val="000000"/>
-          <w:sz w:val="19"/>
-        </w:rPr>
-        <w:t>3</w:t>
-      </w:r>
-    </w:p>
-    <w:p>
-      <w:pPr>
-        <w:tabs>
-          <w:tab w:val="right" w:leader="dot" w:pos="7994"/>
-        </w:tabs>
-        <w:spacing w:after="20" w:line="240" w:lineRule="auto"/>
-        <w:ind w:left="397" w:firstLine="0"/>
-      </w:pPr>
-      <w:r>
-        <w:rPr>
-          <w:rFonts w:ascii="Times New Roman" w:hAnsi="Times New Roman"/>
-          <w:b w:val="0"/>
-          <w:color w:val="000000"/>
-          <w:sz w:val="19"/>
-        </w:rPr>
-        <w:t>2.2. Uloge korisnika</w:t>
-      </w:r>
-      <w:r>
-        <w:rPr>
-          <w:rFonts w:ascii="Times New Roman" w:hAnsi="Times New Roman"/>
-          <w:b w:val="0"/>
-          <w:color w:val="000000"/>
-          <w:sz w:val="19"/>
-        </w:rPr>
-        <w:tab/>
-      </w:r>
-      <w:r>
-        <w:rPr>
-          <w:rFonts w:ascii="Times New Roman" w:hAnsi="Times New Roman"/>
-          <w:b w:val="0"/>
-          <w:color w:val="000000"/>
-          <w:sz w:val="19"/>
-        </w:rPr>
-        <w:t>3</w:t>
-      </w:r>
-    </w:p>
-    <w:p>
-      <w:pPr>
-        <w:tabs>
-          <w:tab w:val="right" w:leader="dot" w:pos="7994"/>
-        </w:tabs>
-        <w:spacing w:after="20" w:line="240" w:lineRule="auto"/>
-        <w:ind w:left="397" w:firstLine="0"/>
-      </w:pPr>
-      <w:r>
-        <w:rPr>
-          <w:rFonts w:ascii="Times New Roman" w:hAnsi="Times New Roman"/>
-          <w:b w:val="0"/>
-          <w:color w:val="000000"/>
-          <w:sz w:val="19"/>
-        </w:rPr>
-        <w:t>2.3. Dokument zahteva</w:t>
-      </w:r>
-      <w:r>
-        <w:rPr>
-          <w:rFonts w:ascii="Times New Roman" w:hAnsi="Times New Roman"/>
-          <w:b w:val="0"/>
-          <w:color w:val="000000"/>
-          <w:sz w:val="19"/>
-        </w:rPr>
-        <w:tab/>
-      </w:r>
-      <w:r>
-        <w:rPr>
-          <w:rFonts w:ascii="Times New Roman" w:hAnsi="Times New Roman"/>
-          <w:b w:val="0"/>
-          <w:color w:val="000000"/>
-          <w:sz w:val="19"/>
-        </w:rPr>
         <w:t>4</w:t>
       </w:r>
     </w:p>
@@ -673,30 +536,22 @@
         <w:ind w:left="397" w:firstLine="0"/>
       </w:pPr>
       <w:r>
-        <w:rPr>
-          <w:rFonts w:ascii="Times New Roman" w:hAnsi="Times New Roman"/>
-          <w:b w:val="0"/>
-          <w:color w:val="000000"/>
-          <w:sz w:val="19"/>
-        </w:rPr>
-        <w:t>2.4. Poslovno pravilo</w:t>
+        <w:t>2.1. Opis procesa</w:t>
+        <w:tab/>
+        <w:t>4</w:t>
       </w:r>
+    </w:p>
+    <w:p>
+      <w:pPr>
+        <w:tabs>
+          <w:tab w:val="right" w:leader="dot" w:pos="7994"/>
+        </w:tabs>
+        <w:spacing w:after="20" w:line="240" w:lineRule="auto"/>
+        <w:ind w:left="397" w:firstLine="0"/>
+      </w:pPr>
       <w:r>
-        <w:rPr>
-          <w:rFonts w:ascii="Times New Roman" w:hAnsi="Times New Roman"/>
-          <w:b w:val="0"/>
-          <w:color w:val="000000"/>
-          <w:sz w:val="19"/>
-        </w:rPr>
+        <w:t>2.2. Uloge korisnika</w:t>
         <w:tab/>
-      </w:r>
-      <w:r>
-        <w:rPr>
-          <w:rFonts w:ascii="Times New Roman" w:hAnsi="Times New Roman"/>
-          <w:b w:val="0"/>
-          <w:color w:val="000000"/>
-          <w:sz w:val="19"/>
-        </w:rPr>
         <w:t>5</w:t>
       </w:r>
     </w:p>
@@ -709,30 +564,36 @@
         <w:ind w:left="397" w:firstLine="0"/>
       </w:pPr>
       <w:r>
-        <w:rPr>
-          <w:rFonts w:ascii="Times New Roman" w:hAnsi="Times New Roman"/>
-          <w:b w:val="0"/>
-          <w:color w:val="000000"/>
-          <w:sz w:val="19"/>
-        </w:rPr>
+        <w:t>2.3. Dokument zahteva</w:t>
+        <w:tab/>
+        <w:t>5</w:t>
+      </w:r>
+    </w:p>
+    <w:p>
+      <w:pPr>
+        <w:tabs>
+          <w:tab w:val="right" w:leader="dot" w:pos="7994"/>
+        </w:tabs>
+        <w:spacing w:after="20" w:line="240" w:lineRule="auto"/>
+        <w:ind w:left="397" w:firstLine="0"/>
+      </w:pPr>
+      <w:r>
+        <w:t>2.4. Poslovno pravilo</w:t>
+        <w:tab/>
+        <w:t>6</w:t>
+      </w:r>
+    </w:p>
+    <w:p>
+      <w:pPr>
+        <w:tabs>
+          <w:tab w:val="right" w:leader="dot" w:pos="7994"/>
+        </w:tabs>
+        <w:spacing w:after="20" w:line="240" w:lineRule="auto"/>
+        <w:ind w:left="397" w:firstLine="0"/>
+      </w:pPr>
+      <w:r>
         <w:t>2.5. Životni ciklus zahteva</w:t>
-      </w:r>
-      <w:r>
-        <w:rPr>
-          <w:rFonts w:ascii="Times New Roman" w:hAnsi="Times New Roman"/>
-          <w:b w:val="0"/>
-          <w:color w:val="000000"/>
-          <w:sz w:val="19"/>
-        </w:rPr>
         <w:tab/>
-      </w:r>
-      <w:r>
-        <w:rPr>
-          <w:rFonts w:ascii="Times New Roman" w:hAnsi="Times New Roman"/>
-          <w:b w:val="0"/>
-          <w:color w:val="000000"/>
-          <w:sz w:val="19"/>
-        </w:rPr>
         <w:t>6</w:t>
       </w:r>
     </w:p>
@@ -745,31 +606,9 @@
         <w:ind w:left="0" w:firstLine="0"/>
       </w:pPr>
       <w:r>
-        <w:rPr>
-          <w:rFonts w:ascii="Times New Roman" w:hAnsi="Times New Roman"/>
-          <w:b/>
-          <w:color w:val="000000"/>
-          <w:sz w:val="19"/>
-        </w:rPr>
         <w:t>3. ZAHTEVI SISTEMA</w:t>
-      </w:r>
-      <w:r>
-        <w:rPr>
-          <w:rFonts w:ascii="Times New Roman" w:hAnsi="Times New Roman"/>
-          <w:b/>
-          <w:color w:val="000000"/>
-          <w:sz w:val="19"/>
-        </w:rPr>
         <w:tab/>
-      </w:r>
-      <w:r>
-        <w:rPr>
-          <w:rFonts w:ascii="Times New Roman" w:hAnsi="Times New Roman"/>
-          <w:b/>
-          <w:color w:val="000000"/>
-          <w:sz w:val="19"/>
-        </w:rPr>
-        <w:t>6</w:t>
+        <w:t>7</w:t>
       </w:r>
     </w:p>
     <w:p>
@@ -781,31 +620,9 @@
         <w:ind w:left="0" w:firstLine="0"/>
       </w:pPr>
       <w:r>
-        <w:rPr>
-          <w:rFonts w:ascii="Times New Roman" w:hAnsi="Times New Roman"/>
-          <w:b/>
-          <w:color w:val="000000"/>
-          <w:sz w:val="19"/>
-        </w:rPr>
         <w:t>4. ARHITEKTURA I TEHNOLOGIJE</w:t>
-      </w:r>
-      <w:r>
-        <w:rPr>
-          <w:rFonts w:ascii="Times New Roman" w:hAnsi="Times New Roman"/>
-          <w:b/>
-          <w:color w:val="000000"/>
-          <w:sz w:val="19"/>
-        </w:rPr>
         <w:tab/>
-      </w:r>
-      <w:r>
-        <w:rPr>
-          <w:rFonts w:ascii="Times New Roman" w:hAnsi="Times New Roman"/>
-          <w:b/>
-          <w:color w:val="000000"/>
-          <w:sz w:val="19"/>
-        </w:rPr>
-        <w:t>7</w:t>
+        <w:t>9</w:t>
       </w:r>
     </w:p>
     <w:p>
@@ -817,66 +634,8 @@
         <w:ind w:left="397" w:firstLine="0"/>
       </w:pPr>
       <w:r>
-        <w:rPr>
-          <w:rFonts w:ascii="Times New Roman" w:hAnsi="Times New Roman"/>
-          <w:b w:val="0"/>
-          <w:color w:val="000000"/>
-          <w:sz w:val="19"/>
-        </w:rPr>
         <w:t>4.3. Tok podataka između slojeva</w:t>
-      </w:r>
-      <w:r>
-        <w:rPr>
-          <w:rFonts w:ascii="Times New Roman" w:hAnsi="Times New Roman"/>
-          <w:b w:val="0"/>
-          <w:color w:val="000000"/>
-          <w:sz w:val="19"/>
-        </w:rPr>
         <w:tab/>
-      </w:r>
-      <w:r>
-        <w:rPr>
-          <w:rFonts w:ascii="Times New Roman" w:hAnsi="Times New Roman"/>
-          <w:b w:val="0"/>
-          <w:color w:val="000000"/>
-          <w:sz w:val="19"/>
-        </w:rPr>
-        <w:t>9</w:t>
-      </w:r>
-    </w:p>
-    <w:p>
-      <w:pPr>
-        <w:tabs>
-          <w:tab w:val="right" w:leader="dot" w:pos="7994"/>
-        </w:tabs>
-        <w:spacing w:after="20" w:line="240" w:lineRule="auto"/>
-        <w:ind w:left="0" w:firstLine="0"/>
-      </w:pPr>
-      <w:r>
-        <w:rPr>
-          <w:rFonts w:ascii="Times New Roman" w:hAnsi="Times New Roman"/>
-          <w:b/>
-          <w:color w:val="000000"/>
-          <w:sz w:val="19"/>
-        </w:rPr>
-        <w:t>5. MODEL PODATAKA</w:t>
-      </w:r>
-      <w:r>
-        <w:rPr>
-          <w:rFonts w:ascii="Times New Roman" w:hAnsi="Times New Roman"/>
-          <w:b/>
-          <w:color w:val="000000"/>
-          <w:sz w:val="19"/>
-        </w:rPr>
-        <w:tab/>
-      </w:r>
-      <w:r>
-        <w:rPr>
-          <w:rFonts w:ascii="Times New Roman" w:hAnsi="Times New Roman"/>
-          <w:b/>
-          <w:color w:val="000000"/>
-          <w:sz w:val="19"/>
-        </w:rPr>
         <w:t>10</w:t>
       </w:r>
     </w:p>
@@ -889,31 +648,23 @@
         <w:ind w:left="0" w:firstLine="0"/>
       </w:pPr>
       <w:r>
-        <w:rPr>
-          <w:rFonts w:ascii="Times New Roman" w:hAnsi="Times New Roman"/>
-          <w:b/>
-          <w:color w:val="000000"/>
-          <w:sz w:val="19"/>
-        </w:rPr>
+        <w:t>5. MODEL PODATAKA</w:t>
+        <w:tab/>
+        <w:t>12</w:t>
+      </w:r>
+    </w:p>
+    <w:p>
+      <w:pPr>
+        <w:tabs>
+          <w:tab w:val="right" w:leader="dot" w:pos="7994"/>
+        </w:tabs>
+        <w:spacing w:after="20" w:line="240" w:lineRule="auto"/>
+        <w:ind w:left="0" w:firstLine="0"/>
+      </w:pPr>
+      <w:r>
         <w:t>6. REALIZACIJA APLIKACIJE</w:t>
-      </w:r>
-      <w:r>
-        <w:rPr>
-          <w:rFonts w:ascii="Times New Roman" w:hAnsi="Times New Roman"/>
-          <w:b/>
-          <w:color w:val="000000"/>
-          <w:sz w:val="19"/>
-        </w:rPr>
         <w:tab/>
-      </w:r>
-      <w:r>
-        <w:rPr>
-          <w:rFonts w:ascii="Times New Roman" w:hAnsi="Times New Roman"/>
-          <w:b/>
-          <w:color w:val="000000"/>
-          <w:sz w:val="19"/>
-        </w:rPr>
-        <w:t>12</w:t>
+        <w:t>13</w:t>
       </w:r>
     </w:p>
     <w:p>
@@ -925,31 +676,9 @@
         <w:ind w:left="397" w:firstLine="0"/>
       </w:pPr>
       <w:r>
-        <w:rPr>
-          <w:rFonts w:ascii="Times New Roman" w:hAnsi="Times New Roman"/>
-          <w:b w:val="0"/>
-          <w:color w:val="000000"/>
-          <w:sz w:val="19"/>
-        </w:rPr>
         <w:t>6.6. Bezbednost i obrada grešaka</w:t>
-      </w:r>
-      <w:r>
-        <w:rPr>
-          <w:rFonts w:ascii="Times New Roman" w:hAnsi="Times New Roman"/>
-          <w:b w:val="0"/>
-          <w:color w:val="000000"/>
-          <w:sz w:val="19"/>
-        </w:rPr>
         <w:tab/>
-      </w:r>
-      <w:r>
-        <w:rPr>
-          <w:rFonts w:ascii="Times New Roman" w:hAnsi="Times New Roman"/>
-          <w:b w:val="0"/>
-          <w:color w:val="000000"/>
-          <w:sz w:val="19"/>
-        </w:rPr>
-        <w:t>13</w:t>
+        <w:t>15</w:t>
       </w:r>
     </w:p>
     <w:p>
@@ -961,31 +690,9 @@
         <w:ind w:left="0" w:firstLine="0"/>
       </w:pPr>
       <w:r>
-        <w:rPr>
-          <w:rFonts w:ascii="Times New Roman" w:hAnsi="Times New Roman"/>
-          <w:b/>
-          <w:color w:val="000000"/>
-          <w:sz w:val="19"/>
-        </w:rPr>
         <w:t>7. TESTIRANJE</w:t>
-      </w:r>
-      <w:r>
-        <w:rPr>
-          <w:rFonts w:ascii="Times New Roman" w:hAnsi="Times New Roman"/>
-          <w:b/>
-          <w:color w:val="000000"/>
-          <w:sz w:val="19"/>
-        </w:rPr>
         <w:tab/>
-      </w:r>
-      <w:r>
-        <w:rPr>
-          <w:rFonts w:ascii="Times New Roman" w:hAnsi="Times New Roman"/>
-          <w:b/>
-          <w:color w:val="000000"/>
-          <w:sz w:val="19"/>
-        </w:rPr>
-        <w:t>15</w:t>
+        <w:t>16</w:t>
       </w:r>
     </w:p>
     <w:p>
@@ -997,102 +704,8 @@
         <w:ind w:left="397" w:firstLine="0"/>
       </w:pPr>
       <w:r>
-        <w:rPr>
-          <w:rFonts w:ascii="Times New Roman" w:hAnsi="Times New Roman"/>
-          <w:b w:val="0"/>
-          <w:color w:val="000000"/>
-          <w:sz w:val="19"/>
-        </w:rPr>
         <w:t>7.3. Prihvatni testovi</w:t>
-      </w:r>
-      <w:r>
-        <w:rPr>
-          <w:rFonts w:ascii="Times New Roman" w:hAnsi="Times New Roman"/>
-          <w:b w:val="0"/>
-          <w:color w:val="000000"/>
-          <w:sz w:val="19"/>
-        </w:rPr>
         <w:tab/>
-      </w:r>
-      <w:r>
-        <w:rPr>
-          <w:rFonts w:ascii="Times New Roman" w:hAnsi="Times New Roman"/>
-          <w:b w:val="0"/>
-          <w:color w:val="000000"/>
-          <w:sz w:val="19"/>
-        </w:rPr>
-        <w:t>16</w:t>
-      </w:r>
-    </w:p>
-    <w:p>
-      <w:pPr>
-        <w:tabs>
-          <w:tab w:val="right" w:leader="dot" w:pos="7994"/>
-        </w:tabs>
-        <w:spacing w:after="20" w:line="240" w:lineRule="auto"/>
-        <w:ind w:left="0" w:firstLine="0"/>
-      </w:pPr>
-      <w:r>
-        <w:rPr>
-          <w:rFonts w:ascii="Times New Roman" w:hAnsi="Times New Roman"/>
-          <w:b/>
-          <w:color w:val="000000"/>
-          <w:sz w:val="19"/>
-        </w:rPr>
-        <w:t>8. KORISNIČKO UPUTSTVO</w:t>
-      </w:r>
-      <w:r>
-        <w:rPr>
-          <w:rFonts w:ascii="Times New Roman" w:hAnsi="Times New Roman"/>
-          <w:b/>
-          <w:color w:val="000000"/>
-          <w:sz w:val="19"/>
-        </w:rPr>
-        <w:tab/>
-      </w:r>
-      <w:r>
-        <w:rPr>
-          <w:rFonts w:ascii="Times New Roman" w:hAnsi="Times New Roman"/>
-          <w:b/>
-          <w:color w:val="000000"/>
-          <w:sz w:val="19"/>
-        </w:rPr>
-        <w:t>17</w:t>
-      </w:r>
-    </w:p>
-    <w:p>
-      <w:pPr>
-        <w:tabs>
-          <w:tab w:val="right" w:leader="dot" w:pos="7994"/>
-        </w:tabs>
-        <w:spacing w:after="20" w:line="240" w:lineRule="auto"/>
-        <w:ind w:left="397" w:firstLine="0"/>
-      </w:pPr>
-      <w:r>
-        <w:rPr>
-          <w:rFonts w:ascii="Times New Roman" w:hAnsi="Times New Roman"/>
-          <w:b w:val="0"/>
-          <w:color w:val="000000"/>
-          <w:sz w:val="19"/>
-        </w:rPr>
-        <w:t>8.2. Održavanje i promena parametra</w:t>
-      </w:r>
-      <w:r>
-        <w:rPr>
-          <w:rFonts w:ascii="Times New Roman" w:hAnsi="Times New Roman"/>
-          <w:b w:val="0"/>
-          <w:color w:val="000000"/>
-          <w:sz w:val="19"/>
-        </w:rPr>
-        <w:tab/>
-      </w:r>
-      <w:r>
-        <w:rPr>
-          <w:rFonts w:ascii="Times New Roman" w:hAnsi="Times New Roman"/>
-          <w:b w:val="0"/>
-          <w:color w:val="000000"/>
-          <w:sz w:val="19"/>
-        </w:rPr>
         <w:t>17</w:t>
       </w:r>
     </w:p>
@@ -1105,30 +718,22 @@
         <w:ind w:left="0" w:firstLine="0"/>
       </w:pPr>
       <w:r>
-        <w:rPr>
-          <w:rFonts w:ascii="Times New Roman" w:hAnsi="Times New Roman"/>
-          <w:b/>
-          <w:color w:val="000000"/>
-          <w:sz w:val="19"/>
-        </w:rPr>
-        <w:t>9. OGRANIČENJA I MOGUĆA UNAPREĐENJA</w:t>
+        <w:t>8. KORISNIČKO UPUTSTVO</w:t>
+        <w:tab/>
+        <w:t>19</w:t>
       </w:r>
+    </w:p>
+    <w:p>
+      <w:pPr>
+        <w:tabs>
+          <w:tab w:val="right" w:leader="dot" w:pos="7994"/>
+        </w:tabs>
+        <w:spacing w:after="20" w:line="240" w:lineRule="auto"/>
+        <w:ind w:left="397" w:firstLine="0"/>
+      </w:pPr>
       <w:r>
-        <w:rPr>
-          <w:rFonts w:ascii="Times New Roman" w:hAnsi="Times New Roman"/>
-          <w:b/>
-          <w:color w:val="000000"/>
-          <w:sz w:val="19"/>
-        </w:rPr>
+        <w:t>8.2. Održavanje i promena parametra</w:t>
         <w:tab/>
-      </w:r>
-      <w:r>
-        <w:rPr>
-          <w:rFonts w:ascii="Times New Roman" w:hAnsi="Times New Roman"/>
-          <w:b/>
-          <w:color w:val="000000"/>
-          <w:sz w:val="19"/>
-        </w:rPr>
         <w:t>19</w:t>
       </w:r>
     </w:p>
@@ -1141,31 +746,9 @@
         <w:ind w:left="0" w:firstLine="0"/>
       </w:pPr>
       <w:r>
-        <w:rPr>
-          <w:rFonts w:ascii="Times New Roman" w:hAnsi="Times New Roman"/>
-          <w:b/>
-          <w:color w:val="000000"/>
-          <w:sz w:val="19"/>
-        </w:rPr>
-        <w:t>10. ZAKLJUČAK</w:t>
-      </w:r>
-      <w:r>
-        <w:rPr>
-          <w:rFonts w:ascii="Times New Roman" w:hAnsi="Times New Roman"/>
-          <w:b/>
-          <w:color w:val="000000"/>
-          <w:sz w:val="19"/>
-        </w:rPr>
+        <w:t>9. OGRANIČENJA I MOGUĆA UNAPREĐENJA</w:t>
         <w:tab/>
-      </w:r>
-      <w:r>
-        <w:rPr>
-          <w:rFonts w:ascii="Times New Roman" w:hAnsi="Times New Roman"/>
-          <w:b/>
-          <w:color w:val="000000"/>
-          <w:sz w:val="19"/>
-        </w:rPr>
-        <w:t>19</w:t>
+        <w:t>21</w:t>
       </w:r>
     </w:p>
     <w:p>
@@ -1177,31 +760,23 @@
         <w:ind w:left="0" w:firstLine="0"/>
       </w:pPr>
       <w:r>
-        <w:rPr>
-          <w:rFonts w:ascii="Times New Roman" w:hAnsi="Times New Roman"/>
-          <w:b/>
-          <w:color w:val="000000"/>
-          <w:sz w:val="19"/>
-        </w:rPr>
+        <w:t>10. ZAKLJUČAK</w:t>
+        <w:tab/>
+        <w:t>21</w:t>
+      </w:r>
+    </w:p>
+    <w:p>
+      <w:pPr>
+        <w:tabs>
+          <w:tab w:val="right" w:leader="dot" w:pos="7994"/>
+        </w:tabs>
+        <w:spacing w:after="20" w:line="240" w:lineRule="auto"/>
+        <w:ind w:left="0" w:firstLine="0"/>
+      </w:pPr>
+      <w:r>
         <w:t>11. LITERATURA</w:t>
-      </w:r>
-      <w:r>
-        <w:rPr>
-          <w:rFonts w:ascii="Times New Roman" w:hAnsi="Times New Roman"/>
-          <w:b/>
-          <w:color w:val="000000"/>
-          <w:sz w:val="19"/>
-        </w:rPr>
         <w:tab/>
-      </w:r>
-      <w:r>
-        <w:rPr>
-          <w:rFonts w:ascii="Times New Roman" w:hAnsi="Times New Roman"/>
-          <w:b/>
-          <w:color w:val="000000"/>
-          <w:sz w:val="19"/>
-        </w:rPr>
-        <w:t>20</w:t>
+        <w:t>22</w:t>
       </w:r>
     </w:p>
     <w:p>
@@ -1569,12 +1144,7 @@
     </w:p>
     <w:p>
       <w:r>
-        <w:rPr>
-          <w:rFonts w:ascii="Times New Roman" w:hAnsi="Times New Roman"/>
-          <w:color w:val="000000"/>
-          <w:sz w:val="24"/>
-        </w:rPr>
-        <w:t>Dokument se korisniku prikazuje kao jedan sažet zapis iz tabele Zahtev. Sadrži podatke o zaposlenom, datum podnošenja, period, status i ukupan broj radnih dana, a verzija za štampu sadrži i mesta za potpise. Tabela DanOdmora predstavlja internu evidenciju koju sistem automatski formira radi provere poslovnog pravila po datumu. Ti zapisi nisu prikazani kao stavke dokumenta. Subota i nedelja se preskaču, dok kalendar državnih praznika nije deo obuhvata prototipa.</w:t>
+        <w:t>Dokument se korisniku prikazuje kao jedan sažet zapis iz tabele Zahtev. Sadrži podatke o zaposlenom, datum podnošenja, period, status i ukupan broj radnih dana, a verzija za štampu sadrži i mesta za potpise. Tabela DanOdmora predstavlja internu evidenciju koju sistem automatski formira radi provere poslovnog pravila po datumu. Ti zapisi nisu prikazani kao stavke dokumenta i opcioni master-detail korisnički interfejs nije implementiran. Subota i nedelja se preskaču, dok kalendar državnih praznika nije deo obuhvata prototipa.</w:t>
       </w:r>
     </w:p>
     <w:tbl>
@@ -1637,6 +1207,10 @@
           </w:tcPr>
           <w:p>
             <w:r>
+              <w:rPr>
+                <w:b/>
+                <w:color w:val="FFFFFF"/>
+              </w:rPr>
               <w:t>Grupa podataka</w:t>
             </w:r>
           </w:p>
@@ -3437,7 +3011,7 @@
           </w:tcPr>
           <w:p>
             <w:r>
-              <w:t>Korisnik može otvoriti i odštampati sažet dokument sa osnovnim podacima i mestima za potpise.</w:t>
+              <w:t>Korisnik može odštampati pojedinačni dokument, celu dostupnu listu ili trenutno filtrirani spisak zahteva.</w:t>
             </w:r>
           </w:p>
         </w:tc>
@@ -3681,12 +3255,7 @@
     </w:p>
     <w:p>
       <w:r>
-        <w:rPr>
-          <w:rFonts w:ascii="Times New Roman" w:hAnsi="Times New Roman"/>
-          <w:color w:val="000000"/>
-          <w:sz w:val="24"/>
-        </w:rPr>
-        <w:t>Rešenje je podeljeno na četiri osnovna projekta i konzolni projekat za testove. ASP.NET MVC projekat obrađuje HTTP zahteve, prikazuje Razor stranice i sprovodi autorizaciju. Poslovna logika validira period i primenjuje poslovno pravilo. Sloj podataka komunicira sa SQL Server bazom. REST servis čita XML konfiguraciju i vraća parametar X u XML formatu. Ovakva podela smanjuje zavisnost korisničkog interfejsa od načina čuvanja podataka.</w:t>
+        <w:t>Rešenje je podeljeno na četiri osnovna projekta i konzolni projekat za testove. ASP.NET MVC projekat koristi posebne ViewModel klase za prijavu, forme, liste i dokument za štampu. Poslovna logika validira period, primenjuje pravilo i priprema dokument. Sloj podataka sadrži odvojene modele i CRUD repozitorijume. REST servis čita XML konfiguraciju i vraća parametar X u XML formatu.</w:t>
       </w:r>
     </w:p>
     <w:p>
@@ -3914,18 +3483,8 @@
             <w:vAlign w:val="center"/>
           </w:tcPr>
           <w:p>
-            <w:pPr>
-              <w:spacing w:after="0"/>
-              <w:ind w:firstLine="0"/>
-              <w:jc w:val="left"/>
-            </w:pPr>
             <w:r>
-              <w:rPr>
-                <w:rFonts w:ascii="Times New Roman" w:hAnsi="Times New Roman"/>
-                <w:color w:val="000000"/>
-                <w:sz w:val="20"/>
-              </w:rPr>
-              <w:t>Modeli, SQL upiti, mapiranje rezultata, transakcije i konkurentni pristup.</w:t>
+              <w:t>Odvojeni modeli i CRUD repozitorijumi; Entity Framework, ADO.NET/stored procedure i DBUtils nasleđivanje.</w:t>
             </w:r>
           </w:p>
         </w:tc>
@@ -4143,18 +3702,8 @@
             <w:vAlign w:val="center"/>
           </w:tcPr>
           <w:p>
-            <w:pPr>
-              <w:spacing w:after="0"/>
-              <w:ind w:firstLine="0"/>
-              <w:jc w:val="left"/>
-            </w:pPr>
             <w:r>
-              <w:rPr>
-                <w:rFonts w:ascii="Times New Roman" w:hAnsi="Times New Roman"/>
-                <w:color w:val="000000"/>
-                <w:sz w:val="20"/>
-              </w:rPr>
-              <w:t>Prijava, autorizacija, kontroleri, Razor prikazi, pretraga i štampa.</w:t>
+              <w:t>Prijava, autorizacija, ViewModel klase, kontroleri, Razor prikazi, pretraga i štampa.</w:t>
             </w:r>
           </w:p>
         </w:tc>
@@ -4271,12 +3820,7 @@
     </w:p>
     <w:p>
       <w:r>
-        <w:rPr>
-          <w:rFonts w:ascii="Times New Roman" w:hAnsi="Times New Roman"/>
-          <w:color w:val="000000"/>
-          <w:sz w:val="24"/>
-        </w:rPr>
-        <w:t>Za trajno čuvanje podataka koristi se Microsoft SQL Server. Upis zahteva, internih zapisa radnih dana i promena statusa izvršava se u transakciji. SQL Server transakcije grupišu više operacija u jednu logičku celinu koja se potvrđuje ili poništava [4]. Razvoj i lokalno pokretanje obavljaju se u Visual Studio 2022 okruženju, uz SQL Server Management Studio za izvršavanje skripti baze.</w:t>
+        <w:t>Za trajno čuvanje podataka koristi se Microsoft SQL Server i Entity Framework 6. Zahtev, zaposleni i interni dani demonstriraju EF pristup. Korisnik se održava standardnim ADO.NET pristupom preko CRUD stored procedura, dok SektorRepozitorijum nasleđuje baznu DBUtils klasu Tabela i koristi parametrizovane SQL naredbe. Upisi se izvršavaju u transakciji, a Visual Studio 2022 i SQL Server Management Studio koriste se za razvoj i proveru.</w:t>
       </w:r>
     </w:p>
     <w:p>
@@ -4947,12 +4491,7 @@
     </w:p>
     <w:p>
       <w:r>
-        <w:rPr>
-          <w:rFonts w:ascii="Times New Roman" w:hAnsi="Times New Roman"/>
-          <w:color w:val="000000"/>
-          <w:sz w:val="24"/>
-        </w:rPr>
-        <w:t>Odvajanje slojeva olakšava testiranje. Funkcije za računanje radnih dana i proveru limita mogu se pozvati bez pokretanja veb pregledača. Repozitorijum se može zameniti testnim izvorom podataka, dok se odgovor servisa može simulirati poznatom vrednošću X. Na taj način greška može da se pronađe u konkretnom sloju, bez istovremenog proveravanja čitave aplikacije.</w:t>
+        <w:t>Odvajanje slojeva olakšava testiranje i održavanje. Svaki model i svaki repozitorijum nalaze se u zasebnom fajlu klase. ZahtevRepozitorijum, ZaposleniRepozitorijum i DanOdmoraRepozitorijum koriste Entity Framework, KorisnikRepozitorijum koristi ADO.NET i stored procedure, a SektorRepozitorijum pokazuje sopstveno nasleđivanje iz klase Tabela.</w:t>
       </w:r>
     </w:p>
     <w:p>
@@ -4975,12 +4514,7 @@
     </w:p>
     <w:p>
       <w:r>
-        <w:rPr>
-          <w:rFonts w:ascii="Times New Roman" w:hAnsi="Times New Roman"/>
-          <w:color w:val="000000"/>
-          <w:sz w:val="24"/>
-        </w:rPr>
-        <w:t>Model baze sastoji se od četiri tabele. Sektor predstavlja organizacionu jedinicu, Zaposleni pripada jednom sektoru, a Zahtev pripada jednom zaposlenom. DanOdmora je interna kalendarska evidencija koja omogućava proveru broja odsutnih po svakom datumu. Veze su tipa jedan-prema-više. Složeni primarni ključ tabele DanOdmora sprečava da se isti datum dva puta evidentira za isti zahtev.</w:t>
+        <w:t>Model baze sastoji se od pet tabela. Sektor predstavlja organizacionu jedinicu, Zaposleni pripada jednom sektoru, a Zahtev pripada jednom zaposlenom. DanOdmora je interna evidencija za proveru broja odsutnih po svakom datumu. Korisnik je nezavisna tabela naloga i uloga bez stranog ključa prema ostalim tabelama; ZaposleniID u njoj služi samo kao logička oznaka identiteta zaposlenog.</w:t>
       </w:r>
     </w:p>
     <w:p>
@@ -5573,6 +5107,81 @@
           </w:p>
         </w:tc>
       </w:tr>
+      <w:tr>
+        <w:tblPrEx>
+          <w:tblBorders>
+            <w:top w:val="single" w:color="D9D9D9" w:sz="6" w:space="0"/>
+            <w:left w:val="single" w:color="D9D9D9" w:sz="6" w:space="0"/>
+            <w:bottom w:val="single" w:color="D9D9D9" w:sz="6" w:space="0"/>
+            <w:right w:val="single" w:color="D9D9D9" w:sz="6" w:space="0"/>
+            <w:insideH w:val="single" w:color="D9D9D9" w:sz="6" w:space="0"/>
+            <w:insideV w:val="single" w:color="D9D9D9" w:sz="6" w:space="0"/>
+          </w:tblBorders>
+          <w:tblCellMar>
+            <w:top w:w="0" w:type="dxa"/>
+            <w:left w:w="108" w:type="dxa"/>
+            <w:bottom w:w="0" w:type="dxa"/>
+            <w:right w:w="108" w:type="dxa"/>
+          </w:tblCellMar>
+        </w:tblPrEx>
+        <w:trPr>
+          <w:jc w:val="center"/>
+        </w:trPr>
+        <w:tc>
+          <w:tcPr>
+            <w:tcW w:w="1701" w:type="dxa"/>
+            <w:shd w:val="clear" w:color="auto" w:fill="F5F8FC"/>
+            <w:tcMar>
+              <w:top w:w="100" w:type="dxa"/>
+              <w:left w:w="120" w:type="dxa"/>
+              <w:bottom w:w="100" w:type="dxa"/>
+              <w:right w:w="120" w:type="dxa"/>
+            </w:tcMar>
+            <w:vAlign w:val="center"/>
+          </w:tcPr>
+          <w:p>
+            <w:r>
+              <w:t>Korisnik</w:t>
+            </w:r>
+          </w:p>
+        </w:tc>
+        <w:tc>
+          <w:tcPr>
+            <w:tcW w:w="3061" w:type="dxa"/>
+            <w:shd w:val="clear" w:color="auto" w:fill="F5F8FC"/>
+            <w:tcMar>
+              <w:top w:w="100" w:type="dxa"/>
+              <w:left w:w="120" w:type="dxa"/>
+              <w:bottom w:w="100" w:type="dxa"/>
+              <w:right w:w="120" w:type="dxa"/>
+            </w:tcMar>
+            <w:vAlign w:val="center"/>
+          </w:tcPr>
+          <w:p>
+            <w:r>
+              <w:t>Nezavisna tabela naloga i uloga.</w:t>
+            </w:r>
+          </w:p>
+        </w:tc>
+        <w:tc>
+          <w:tcPr>
+            <w:tcW w:w="3345" w:type="dxa"/>
+            <w:shd w:val="clear" w:color="auto" w:fill="F5F8FC"/>
+            <w:tcMar>
+              <w:top w:w="100" w:type="dxa"/>
+              <w:left w:w="120" w:type="dxa"/>
+              <w:bottom w:w="100" w:type="dxa"/>
+              <w:right w:w="120" w:type="dxa"/>
+            </w:tcMar>
+            <w:vAlign w:val="center"/>
+          </w:tcPr>
+          <w:p>
+            <w:r>
+              <w:t>Bez stranog ključa; jedinstveno korisničko ime; dozvoljena uloga; salt i hash lozinke.</w:t>
+            </w:r>
+          </w:p>
+        </w:tc>
+      </w:tr>
     </w:tbl>
     <w:p>
       <w:pPr>
@@ -5590,12 +5199,7 @@
     </w:p>
     <w:p>
       <w:r>
-        <w:rPr>
-          <w:rFonts w:ascii="Times New Roman" w:hAnsi="Times New Roman"/>
-          <w:color w:val="000000"/>
-          <w:sz w:val="24"/>
-        </w:rPr>
-        <w:t>Baza sadrži CHECK ograničenja za period i status, strane ključeve između tabela i indekse za česta pretraživanja. Kolona Verzija tipa rowversion koristi se za optimističku kontrolu konkurentnosti. Kada korisnik pokuša da sačuva zastarelu formu, vrednost verzije više ne odgovara zapisu u bazi i operacija se odbija porukom da je zahtev u međuvremenu promenjen.</w:t>
+        <w:t>Validacije su postavljene u modelima i ViewModel klasama pomoću DataAnnotations atributa, u poslovnoj logici i kroz CHECK i FOREIGN KEY ograničenja baze. Obavezni su naziv sektora, ime zaposlenog, radno mesto, uloga i ispravan period. Kolona Verzija tipa rowversion koristi se za optimističku kontrolu konkurentnosti. Tabela Korisnik ima jedinstveno korisničko ime, dozvoljenu ulogu, salt i hash lozinke, ali nema strani ključ.</w:t>
       </w:r>
     </w:p>
     <w:p>
@@ -5628,22 +5232,12 @@
     </w:p>
     <w:p>
       <w:r>
-        <w:rPr>
-          <w:rFonts w:ascii="Times New Roman" w:hAnsi="Times New Roman"/>
-          <w:color w:val="000000"/>
-          <w:sz w:val="24"/>
-        </w:rPr>
-        <w:t>Za autentifikaciju se koristi Forms Authentication. Posle uspešne prijave formira se autentifikacioni tiket koji u dodatnim podacima čuva ulogu korisnika. Tokom svakog zahteva aplikacija rekonstruiše identitet i uloge, nakon čega Authorize atribut ograničava dozvoljene kontrolerske akcije. Zaposleni ne može pozivanjem tuđeg URL-a otvoriti zahtev drugog zaposlenog, jer kontroler proverava vlasništvo pre vraćanja prikaza.</w:t>
+        <w:t>Za autentifikaciju se koristi Forms Authentication, dok se korisnički nalog učitava iz nezavisne tabele Korisnik stored procedurom Korisnik_DajPoKorisnickomImenu. Posle uspešne prijave formira se tiket koji čuva ulogu i logičku oznaku zaposlenog. Authorize atribut ograničava kontrolerske akcije, a dodatna provera vlasništva sprečava zaposlenog da promenom URL-a otvori tuđi zahtev.</w:t>
       </w:r>
     </w:p>
     <w:p>
       <w:r>
-        <w:rPr>
-          <w:rFonts w:ascii="Times New Roman" w:hAnsi="Times New Roman"/>
-          <w:color w:val="000000"/>
-          <w:sz w:val="24"/>
-        </w:rPr>
-        <w:t>Lozinke demonstracionih naloga proveravaju se PBKDF2-SHA256 algoritmom sa 100.000 iteracija. Aplikacija je namenjena lokalnoj demonstraciji; za produkcionu upotrebu bilo bi potrebno uvesti individualne naloge, HTTPS, politiku zaključavanja, promenu lozinke i revizijski dnevnik.</w:t>
+        <w:t>Lozinke se u tabeli Korisnik ne čuvaju kao običan tekst, već kao PBKDF2-SHA256 salt i hash sa 100.000 iteracija. Demonstraciona baza sadrži jedan nalog zaposlenog i jedan nalog kadrovske službe. Za produkcionu upotrebu bilo bi potrebno dodati HTTPS, politiku zaključavanja, promenu lozinke i revizijski dnevnik.</w:t>
       </w:r>
     </w:p>
     <w:p>
@@ -5900,75 +5494,14 @@
         <w:jc w:val="left"/>
       </w:pPr>
       <w:r>
-        <w:rPr>
-          <w:rFonts w:ascii="Consolas" w:hAnsi="Consolas"/>
-          <w:color w:val="000000"/>
-          <w:sz w:val="18"/>
-        </w:rPr>
         <w:t>[HttpGet, Route("api/parametri")]</w:t>
-      </w:r>
-      <w:r>
-        <w:rPr>
-          <w:rFonts w:ascii="Consolas" w:hAnsi="Consolas"/>
-          <w:color w:val="000000"/>
-          <w:sz w:val="18"/>
-        </w:rPr>
-        <w:br w:type="textWrapping"/>
-      </w:r>
-      <w:r>
-        <w:rPr>
-          <w:rFonts w:ascii="Consolas" w:hAnsi="Consolas"/>
-          <w:color w:val="000000"/>
-          <w:sz w:val="18"/>
-        </w:rPr>
-        <w:t>public HttpResponseMessage Get()</w:t>
-      </w:r>
-      <w:r>
-        <w:rPr>
-          <w:rFonts w:ascii="Consolas" w:hAnsi="Consolas"/>
-          <w:color w:val="000000"/>
-          <w:sz w:val="18"/>
-        </w:rPr>
-        <w:br w:type="textWrapping"/>
-      </w:r>
-      <w:r>
-        <w:rPr>
-          <w:rFonts w:ascii="Consolas" w:hAnsi="Consolas"/>
-          <w:color w:val="000000"/>
-          <w:sz w:val="18"/>
-        </w:rPr>
+        <w:br/>
+        <w:t>public HttpResponseMessage DajParametre()</w:t>
+        <w:br/>
         <w:t>{</w:t>
-      </w:r>
-      <w:r>
-        <w:rPr>
-          <w:rFonts w:ascii="Consolas" w:hAnsi="Consolas"/>
-          <w:color w:val="000000"/>
-          <w:sz w:val="18"/>
-        </w:rPr>
-        <w:br w:type="textWrapping"/>
-      </w:r>
-      <w:r>
-        <w:rPr>
-          <w:rFonts w:ascii="Consolas" w:hAnsi="Consolas"/>
-          <w:color w:val="000000"/>
-          <w:sz w:val="18"/>
-        </w:rPr>
+        <w:br/>
         <w:t xml:space="preserve">    // učitavanje X iz eksternog XML fajla</w:t>
-      </w:r>
-      <w:r>
-        <w:rPr>
-          <w:rFonts w:ascii="Consolas" w:hAnsi="Consolas"/>
-          <w:color w:val="000000"/>
-          <w:sz w:val="18"/>
-        </w:rPr>
-        <w:br w:type="textWrapping"/>
-      </w:r>
-      <w:r>
-        <w:rPr>
-          <w:rFonts w:ascii="Consolas" w:hAnsi="Consolas"/>
-          <w:color w:val="000000"/>
-          <w:sz w:val="18"/>
-        </w:rPr>
+        <w:br/>
         <w:t>}</w:t>
       </w:r>
     </w:p>
@@ -5983,22 +5516,12 @@
     </w:p>
     <w:p>
       <w:r>
-        <w:rPr>
-          <w:rFonts w:ascii="Times New Roman" w:hAnsi="Times New Roman"/>
-          <w:color w:val="000000"/>
-          <w:sz w:val="24"/>
-        </w:rPr>
-        <w:t>Glavna tabela prikazuje broj dokumenta, zaposlenog i sektor, period, broj radnih dana i status. Zaposleni dobija samo svoje redove, dok kadrovska služba vidi sve zahteve. Pretraga obuhvata ime zaposlenog, naziv sektora i status. Otvaranjem reda prikazuje se sažet dokument sa podacima o zaposlenom, periodom, brojem radnih dana i statusom.</w:t>
+        <w:t>Glavna tabela prikazuje broj dokumenta, zaposlenog i sektor, period, broj radnih dana i status. Zaposleni dobija samo svoje redove, dok kadrovska služba vidi sve zahteve. Pretraga obuhvata ime zaposlenog, naziv sektora i status. Otvaranjem reda prikazuje se sažet dokument pripremljen u poslovnoj klasi PripremaDokumenta.</w:t>
       </w:r>
     </w:p>
     <w:p>
       <w:r>
-        <w:rPr>
-          <w:rFonts w:ascii="Times New Roman" w:hAnsi="Times New Roman"/>
-          <w:color w:val="000000"/>
-          <w:sz w:val="24"/>
-        </w:rPr>
-        <w:t>Dugme „Štampaj“ poziva funkciju pregledača za štampanje. Poseban CSS stil uklanja navigaciju i akcione komande, dok na dokumentu ostavlja osnovne podatke zahteva, ukupan broj radnih dana i mesta za potpise zaposlenog i odgovornog lica.</w:t>
+        <w:t>Na stranici evidencije dugme „Štampaj listu“ štampa sve trenutno prikazane redove: bez filtera spisak svih dostupnih zahteva, a sa filterom filtrirani spisak. Na pojedinačnom prikazu dugme „Štampaj“ štampa parametarski izabran dokument. CSS uklanja navigaciju i akcione komande, a zadržava podatke zahteva, ukupan broj radnih dana i mesta za potpise.</w:t>
       </w:r>
     </w:p>
     <w:p>
@@ -8505,12 +8028,7 @@
         <w:jc w:val="left"/>
       </w:pPr>
       <w:r>
-        <w:rPr>
-          <w:rFonts w:ascii="Times New Roman" w:hAnsi="Times New Roman"/>
-          <w:color w:val="000000"/>
-          <w:sz w:val="24"/>
-        </w:rPr>
-        <w:t>1. U programu SQL Server Management Studio izvršiti skriptu Baza/01_Baza.sql samo pri prvom kreiranju baze.</w:t>
+        <w:t>1. U programu SQL Server Management Studio izvršiti skriptu Baza/01_Baza.sql samo pri prvom kreiranju baze. Za postojeću bazu iz ranije verzije izvršiti Baza/03_KorekcijeProfesor.sql.</w:t>
       </w:r>
     </w:p>
     <w:p>
@@ -9152,12 +8670,7 @@
         <w:spacing w:after="80" w:line="288" w:lineRule="auto"/>
       </w:pPr>
       <w:r>
-        <w:rPr>
-          <w:rFonts w:ascii="Times New Roman" w:hAnsi="Times New Roman"/>
-          <w:color w:val="000000"/>
-          <w:sz w:val="24"/>
-        </w:rPr>
-        <w:t>Skripta 01_Baza.sql namenjena je prvom kreiranju baze i namerno odbija prepisivanje postojeće baze. Time se sprečava slučajan gubitak podataka tokom ponovnog pokretanja projekta. Ako je potrebna promena strukture, treba napraviti posebnu migracionu skriptu koja menja samo neophodne objekte i koja se prvo proverava nad kopijom baze.</w:t>
+        <w:t>Skripta 01_Baza.sql namenjena je prvom kreiranju baze i ne prepisuje postojeću bazu. Za raniju verziju koristi se migraciona skripta 03_KorekcijeProfesor.sql, koja čuva podatke, dodaje nezavisnu tabelu Korisnik, CRUD stored procedure, validaciona ograničenja i korisnika baze sa ograničenim pravima.</w:t>
       </w:r>
     </w:p>
     <w:p>
@@ -9333,12 +8846,7 @@
         <w:jc w:val="left"/>
       </w:pPr>
       <w:r>
-        <w:rPr>
-          <w:rFonts w:ascii="Times New Roman" w:hAnsi="Times New Roman"/>
-          <w:color w:val="000000"/>
-          <w:sz w:val="24"/>
-        </w:rPr>
-        <w:t>15. Po potrebi otvoriti prikaz zaposlenih ili odštampati dokument.</w:t>
+        <w:t>15. Po potrebi otvoriti prikaz zaposlenih, odštampati sve ili filtrirane zahteve i otvoriti pojedinačni dokument za štampu.</w:t>
       </w:r>
     </w:p>
     <w:p>
@@ -9390,12 +8898,7 @@
         <w:spacing w:after="80" w:line="288" w:lineRule="auto"/>
       </w:pPr>
       <w:r>
-        <w:rPr>
-          <w:rFonts w:ascii="Times New Roman" w:hAnsi="Times New Roman"/>
-          <w:color w:val="000000"/>
-          <w:sz w:val="24"/>
-        </w:rPr>
-        <w:t>Aplikacija podržava elektronsko podnošenje i odobravanje zahteva za godišnji odmor. Razdvojene uloge, višeslojna arhitektura, REST konfiguracija i SQL transakcije omogućavaju doslednu primenu parametrizovanog poslovnog pravila. Rešenje ispunjava cilj seminarskog rada i daje osnovu za dalji razvoj sistema za upravljanje odsustvima.</w:t>
+        <w:t>Aplikacija podržava elektronsko podnošenje i odobravanje zahteva za godišnji odmor. Razdvojene uloge, ViewModel klase, odvojeni modeli i CRUD repozitorijumi, Entity Framework, stored procedure, DBUtils nasleđivanje, REST konfiguracija i SQL transakcije omogućavaju doslednu primenu parametrizovanog poslovnog pravila. Rešenje ispunjava obavezne zahteve seminarskog rada bez opcionog master-detail interfejsa.</w:t>
       </w:r>
     </w:p>
     <w:p>

</xml_diff>